<commit_message>
Support docx and plain output with pandoc
</commit_message>
<xml_diff>
--- a/pandoc/reference.docx
+++ b/pandoc/reference.docx
@@ -335,6 +335,7 @@
             <w:pPr>
               <w:pStyle w:val="Compact"/>
               <w:widowControl/>
+              <w:suppressAutoHyphens w:val="true"/>
               <w:spacing w:before="36" w:after="36"/>
               <w:jc w:val="left"/>
               <w:rPr>
@@ -369,6 +370,7 @@
             <w:pPr>
               <w:pStyle w:val="Compact"/>
               <w:widowControl/>
+              <w:suppressAutoHyphens w:val="true"/>
               <w:spacing w:before="36" w:after="36"/>
               <w:jc w:val="left"/>
               <w:rPr>
@@ -403,6 +405,7 @@
             <w:pPr>
               <w:pStyle w:val="Compact"/>
               <w:widowControl/>
+              <w:suppressAutoHyphens w:val="true"/>
               <w:spacing w:before="36" w:after="36"/>
               <w:jc w:val="left"/>
               <w:rPr>
@@ -434,6 +437,7 @@
             <w:pPr>
               <w:pStyle w:val="Compact"/>
               <w:widowControl/>
+              <w:suppressAutoHyphens w:val="true"/>
               <w:spacing w:before="36" w:after="36"/>
               <w:jc w:val="left"/>
               <w:rPr>
@@ -575,6 +579,264 @@
 </w:footnotes>
 </file>
 
+<file path=word/numbering.xml><?xml version="1.0" encoding="utf-8"?>
+<w:numbering xmlns:w="http://schemas.openxmlformats.org/wordprocessingml/2006/main" xmlns:o="urn:schemas-microsoft-com:office:office" xmlns:r="http://schemas.openxmlformats.org/officeDocument/2006/relationships" xmlns:v="urn:schemas-microsoft-com:vml" xmlns:mc="http://schemas.openxmlformats.org/markup-compatibility/2006" xmlns:w14="http://schemas.microsoft.com/office/word/2010/wordml" mc:Ignorable="w14">
+  <w:abstractNum w:abstractNumId="1">
+    <w:lvl w:ilvl="0">
+      <w:start w:val="1"/>
+      <w:numFmt w:val="none"/>
+      <w:suff w:val="nothing"/>
+      <w:lvlText w:val=""/>
+      <w:lvlJc w:val="left"/>
+      <w:pPr>
+        <w:tabs>
+          <w:tab w:val="num" w:pos="0"/>
+        </w:tabs>
+        <w:ind w:left="0" w:hanging="0"/>
+      </w:pPr>
+      <w:rPr/>
+    </w:lvl>
+    <w:lvl w:ilvl="1">
+      <w:start w:val="1"/>
+      <w:numFmt w:val="none"/>
+      <w:suff w:val="nothing"/>
+      <w:lvlText w:val=""/>
+      <w:lvlJc w:val="left"/>
+      <w:pPr>
+        <w:tabs>
+          <w:tab w:val="num" w:pos="0"/>
+        </w:tabs>
+        <w:ind w:left="0" w:hanging="0"/>
+      </w:pPr>
+      <w:rPr/>
+    </w:lvl>
+    <w:lvl w:ilvl="2">
+      <w:start w:val="1"/>
+      <w:numFmt w:val="none"/>
+      <w:suff w:val="nothing"/>
+      <w:lvlText w:val=""/>
+      <w:lvlJc w:val="left"/>
+      <w:pPr>
+        <w:tabs>
+          <w:tab w:val="num" w:pos="0"/>
+        </w:tabs>
+        <w:ind w:left="0" w:hanging="0"/>
+      </w:pPr>
+      <w:rPr/>
+    </w:lvl>
+    <w:lvl w:ilvl="3">
+      <w:start w:val="1"/>
+      <w:numFmt w:val="none"/>
+      <w:suff w:val="nothing"/>
+      <w:lvlText w:val=""/>
+      <w:lvlJc w:val="left"/>
+      <w:pPr>
+        <w:tabs>
+          <w:tab w:val="num" w:pos="0"/>
+        </w:tabs>
+        <w:ind w:left="0" w:hanging="0"/>
+      </w:pPr>
+      <w:rPr/>
+    </w:lvl>
+    <w:lvl w:ilvl="4">
+      <w:start w:val="1"/>
+      <w:numFmt w:val="none"/>
+      <w:suff w:val="nothing"/>
+      <w:lvlText w:val=""/>
+      <w:lvlJc w:val="left"/>
+      <w:pPr>
+        <w:tabs>
+          <w:tab w:val="num" w:pos="0"/>
+        </w:tabs>
+        <w:ind w:left="0" w:hanging="0"/>
+      </w:pPr>
+      <w:rPr/>
+    </w:lvl>
+    <w:lvl w:ilvl="5">
+      <w:start w:val="1"/>
+      <w:numFmt w:val="none"/>
+      <w:suff w:val="nothing"/>
+      <w:lvlText w:val=""/>
+      <w:lvlJc w:val="left"/>
+      <w:pPr>
+        <w:tabs>
+          <w:tab w:val="num" w:pos="0"/>
+        </w:tabs>
+        <w:ind w:left="0" w:hanging="0"/>
+      </w:pPr>
+      <w:rPr/>
+    </w:lvl>
+    <w:lvl w:ilvl="6">
+      <w:start w:val="1"/>
+      <w:numFmt w:val="none"/>
+      <w:suff w:val="nothing"/>
+      <w:lvlText w:val=""/>
+      <w:lvlJc w:val="left"/>
+      <w:pPr>
+        <w:tabs>
+          <w:tab w:val="num" w:pos="0"/>
+        </w:tabs>
+        <w:ind w:left="0" w:hanging="0"/>
+      </w:pPr>
+      <w:rPr/>
+    </w:lvl>
+    <w:lvl w:ilvl="7">
+      <w:start w:val="1"/>
+      <w:numFmt w:val="none"/>
+      <w:suff w:val="nothing"/>
+      <w:lvlText w:val=""/>
+      <w:lvlJc w:val="left"/>
+      <w:pPr>
+        <w:tabs>
+          <w:tab w:val="num" w:pos="0"/>
+        </w:tabs>
+        <w:ind w:left="0" w:hanging="0"/>
+      </w:pPr>
+      <w:rPr/>
+    </w:lvl>
+    <w:lvl w:ilvl="8">
+      <w:start w:val="1"/>
+      <w:numFmt w:val="none"/>
+      <w:suff w:val="nothing"/>
+      <w:lvlText w:val=""/>
+      <w:lvlJc w:val="left"/>
+      <w:pPr>
+        <w:tabs>
+          <w:tab w:val="num" w:pos="0"/>
+        </w:tabs>
+        <w:ind w:left="0" w:hanging="0"/>
+      </w:pPr>
+      <w:rPr/>
+    </w:lvl>
+  </w:abstractNum>
+  <w:abstractNum w:abstractNumId="2">
+    <w:lvl w:ilvl="0">
+      <w:start w:val="1"/>
+      <w:numFmt w:val="none"/>
+      <w:suff w:val="nothing"/>
+      <w:lvlText w:val=""/>
+      <w:lvlJc w:val="left"/>
+      <w:pPr>
+        <w:tabs>
+          <w:tab w:val="num" w:pos="0"/>
+        </w:tabs>
+        <w:ind w:left="0" w:hanging="0"/>
+      </w:pPr>
+    </w:lvl>
+    <w:lvl w:ilvl="1">
+      <w:start w:val="1"/>
+      <w:numFmt w:val="none"/>
+      <w:suff w:val="nothing"/>
+      <w:lvlText w:val=""/>
+      <w:lvlJc w:val="left"/>
+      <w:pPr>
+        <w:tabs>
+          <w:tab w:val="num" w:pos="0"/>
+        </w:tabs>
+        <w:ind w:left="0" w:hanging="0"/>
+      </w:pPr>
+    </w:lvl>
+    <w:lvl w:ilvl="2">
+      <w:start w:val="1"/>
+      <w:numFmt w:val="none"/>
+      <w:suff w:val="nothing"/>
+      <w:lvlText w:val=""/>
+      <w:lvlJc w:val="left"/>
+      <w:pPr>
+        <w:tabs>
+          <w:tab w:val="num" w:pos="0"/>
+        </w:tabs>
+        <w:ind w:left="0" w:hanging="0"/>
+      </w:pPr>
+    </w:lvl>
+    <w:lvl w:ilvl="3">
+      <w:start w:val="1"/>
+      <w:numFmt w:val="none"/>
+      <w:suff w:val="nothing"/>
+      <w:lvlText w:val=""/>
+      <w:lvlJc w:val="left"/>
+      <w:pPr>
+        <w:tabs>
+          <w:tab w:val="num" w:pos="0"/>
+        </w:tabs>
+        <w:ind w:left="0" w:hanging="0"/>
+      </w:pPr>
+    </w:lvl>
+    <w:lvl w:ilvl="4">
+      <w:start w:val="1"/>
+      <w:numFmt w:val="none"/>
+      <w:suff w:val="nothing"/>
+      <w:lvlText w:val=""/>
+      <w:lvlJc w:val="left"/>
+      <w:pPr>
+        <w:tabs>
+          <w:tab w:val="num" w:pos="0"/>
+        </w:tabs>
+        <w:ind w:left="0" w:hanging="0"/>
+      </w:pPr>
+    </w:lvl>
+    <w:lvl w:ilvl="5">
+      <w:start w:val="1"/>
+      <w:numFmt w:val="none"/>
+      <w:suff w:val="nothing"/>
+      <w:lvlText w:val=""/>
+      <w:lvlJc w:val="left"/>
+      <w:pPr>
+        <w:tabs>
+          <w:tab w:val="num" w:pos="0"/>
+        </w:tabs>
+        <w:ind w:left="0" w:hanging="0"/>
+      </w:pPr>
+    </w:lvl>
+    <w:lvl w:ilvl="6">
+      <w:start w:val="1"/>
+      <w:numFmt w:val="none"/>
+      <w:suff w:val="nothing"/>
+      <w:lvlText w:val=""/>
+      <w:lvlJc w:val="left"/>
+      <w:pPr>
+        <w:tabs>
+          <w:tab w:val="num" w:pos="0"/>
+        </w:tabs>
+        <w:ind w:left="0" w:hanging="0"/>
+      </w:pPr>
+    </w:lvl>
+    <w:lvl w:ilvl="7">
+      <w:start w:val="1"/>
+      <w:numFmt w:val="none"/>
+      <w:suff w:val="nothing"/>
+      <w:lvlText w:val=""/>
+      <w:lvlJc w:val="left"/>
+      <w:pPr>
+        <w:tabs>
+          <w:tab w:val="num" w:pos="0"/>
+        </w:tabs>
+        <w:ind w:left="0" w:hanging="0"/>
+      </w:pPr>
+    </w:lvl>
+    <w:lvl w:ilvl="8">
+      <w:start w:val="1"/>
+      <w:numFmt w:val="none"/>
+      <w:suff w:val="nothing"/>
+      <w:lvlText w:val=""/>
+      <w:lvlJc w:val="left"/>
+      <w:pPr>
+        <w:tabs>
+          <w:tab w:val="num" w:pos="0"/>
+        </w:tabs>
+        <w:ind w:left="0" w:hanging="0"/>
+      </w:pPr>
+    </w:lvl>
+  </w:abstractNum>
+  <w:num w:numId="1">
+    <w:abstractNumId w:val="1"/>
+  </w:num>
+  <w:num w:numId="2">
+    <w:abstractNumId w:val="2"/>
+  </w:num>
+</w:numbering>
+</file>
+
 <file path=word/styles.xml><?xml version="1.0" encoding="utf-8"?>
 <w:styles xmlns:w="http://schemas.openxmlformats.org/wordprocessingml/2006/main" xmlns:w14="http://schemas.microsoft.com/office/word/2010/wordml" xmlns:mc="http://schemas.openxmlformats.org/markup-compatibility/2006" mc:Ignorable="w14">
   <w:docDefaults>
@@ -598,12 +860,13 @@
     <w:qFormat/>
     <w:pPr>
       <w:widowControl/>
+      <w:suppressAutoHyphens w:val="true"/>
       <w:bidi w:val="0"/>
       <w:spacing w:before="0" w:after="200"/>
       <w:jc w:val="left"/>
     </w:pPr>
     <w:rPr>
-      <w:rFonts w:ascii="Aptos" w:hAnsi="Aptos" w:eastAsia="Aptos" w:cs="" w:asciiTheme="minorHAnsi" w:cstheme="minorBidi" w:eastAsiaTheme="minorHAnsi" w:hAnsiTheme="minorHAnsi"/>
+      <w:rFonts w:ascii="Gentium" w:hAnsi="Gentium" w:eastAsia="Aptos" w:cs="" w:cstheme="minorBidi" w:eastAsiaTheme="minorHAnsi"/>
       <w:color w:val="auto"/>
       <w:kern w:val="0"/>
       <w:sz w:val="24"/>
@@ -626,8 +889,8 @@
       <w:outlineLvl w:val="0"/>
     </w:pPr>
     <w:rPr>
-      <w:rFonts w:ascii="Aptos Display" w:hAnsi="Aptos Display" w:eastAsia="" w:cs="" w:asciiTheme="majorHAnsi" w:cstheme="majorBidi" w:eastAsiaTheme="majorEastAsia" w:hAnsiTheme="majorHAnsi"/>
-      <w:color w:themeColor="accent1" w:themeShade="bf" w:val="0F4761"/>
+      <w:rFonts w:ascii="Gentium" w:hAnsi="Gentium" w:eastAsia="" w:cs="" w:cstheme="majorBidi" w:eastAsiaTheme="majorEastAsia"/>
+      <w:color w:val="auto"/>
       <w:sz w:val="40"/>
       <w:szCs w:val="40"/>
     </w:rPr>
@@ -649,8 +912,8 @@
       <w:outlineLvl w:val="1"/>
     </w:pPr>
     <w:rPr>
-      <w:rFonts w:ascii="Aptos Display" w:hAnsi="Aptos Display" w:eastAsia="" w:cs="" w:asciiTheme="majorHAnsi" w:cstheme="majorBidi" w:eastAsiaTheme="majorEastAsia" w:hAnsiTheme="majorHAnsi"/>
-      <w:color w:themeColor="accent1" w:themeShade="bf" w:val="0F4761"/>
+      <w:rFonts w:ascii="Gentium" w:hAnsi="Gentium" w:eastAsia="" w:cs="" w:cstheme="majorBidi" w:eastAsiaTheme="majorEastAsia"/>
+      <w:color w:val="000000"/>
       <w:sz w:val="32"/>
       <w:szCs w:val="32"/>
     </w:rPr>
@@ -672,8 +935,8 @@
       <w:outlineLvl w:val="2"/>
     </w:pPr>
     <w:rPr>
-      <w:rFonts w:eastAsia="" w:cs="" w:cstheme="majorBidi" w:eastAsiaTheme="majorEastAsia"/>
-      <w:color w:themeColor="accent1" w:themeShade="bf" w:val="0F4761"/>
+      <w:rFonts w:ascii="Gentium" w:hAnsi="Gentium" w:eastAsia="" w:cs="" w:cstheme="majorBidi" w:eastAsiaTheme="majorEastAsia"/>
+      <w:color w:val="000000"/>
       <w:sz w:val="28"/>
       <w:szCs w:val="28"/>
     </w:rPr>
@@ -695,10 +958,10 @@
       <w:outlineLvl w:val="3"/>
     </w:pPr>
     <w:rPr>
-      <w:rFonts w:eastAsia="" w:cs="" w:cstheme="majorBidi" w:eastAsiaTheme="majorEastAsia"/>
+      <w:rFonts w:ascii="Gentium" w:hAnsi="Gentium" w:eastAsia="" w:cs="" w:cstheme="majorBidi" w:eastAsiaTheme="majorEastAsia"/>
       <w:i/>
       <w:iCs/>
-      <w:color w:themeColor="accent1" w:themeShade="bf" w:val="0F4761"/>
+      <w:color w:val="000000"/>
     </w:rPr>
   </w:style>
   <w:style w:type="paragraph" w:styleId="Heading5">
@@ -718,8 +981,8 @@
       <w:outlineLvl w:val="4"/>
     </w:pPr>
     <w:rPr>
-      <w:rFonts w:eastAsia="" w:cs="" w:cstheme="majorBidi" w:eastAsiaTheme="majorEastAsia"/>
-      <w:color w:themeColor="accent1" w:themeShade="bf" w:val="0F4761"/>
+      <w:rFonts w:ascii="Gentium" w:hAnsi="Gentium" w:eastAsia="" w:cs="" w:cstheme="majorBidi" w:eastAsiaTheme="majorEastAsia"/>
+      <w:color w:val="000000"/>
     </w:rPr>
   </w:style>
   <w:style w:type="paragraph" w:styleId="Heading6">
@@ -739,7 +1002,7 @@
       <w:outlineLvl w:val="5"/>
     </w:pPr>
     <w:rPr>
-      <w:rFonts w:eastAsia="" w:cs="" w:cstheme="majorBidi" w:eastAsiaTheme="majorEastAsia"/>
+      <w:rFonts w:ascii="Gentium" w:hAnsi="Gentium" w:eastAsia="" w:cs="" w:cstheme="majorBidi" w:eastAsiaTheme="majorEastAsia"/>
       <w:i/>
       <w:iCs/>
       <w:color w:themeColor="text1" w:themeTint="a6" w:val="595959"/>
@@ -762,7 +1025,7 @@
       <w:outlineLvl w:val="6"/>
     </w:pPr>
     <w:rPr>
-      <w:rFonts w:eastAsia="" w:cs="" w:cstheme="majorBidi" w:eastAsiaTheme="majorEastAsia"/>
+      <w:rFonts w:ascii="Gentium" w:hAnsi="Gentium" w:eastAsia="" w:cs="" w:cstheme="majorBidi" w:eastAsiaTheme="majorEastAsia"/>
       <w:color w:themeColor="text1" w:themeTint="a6" w:val="595959"/>
     </w:rPr>
   </w:style>
@@ -783,7 +1046,7 @@
       <w:outlineLvl w:val="7"/>
     </w:pPr>
     <w:rPr>
-      <w:rFonts w:eastAsia="" w:cs="" w:cstheme="majorBidi" w:eastAsiaTheme="majorEastAsia"/>
+      <w:rFonts w:ascii="Gentium" w:hAnsi="Gentium" w:eastAsia="" w:cs="" w:cstheme="majorBidi" w:eastAsiaTheme="majorEastAsia"/>
       <w:i/>
       <w:iCs/>
       <w:color w:themeColor="text1" w:themeTint="d8" w:val="272727"/>
@@ -806,7 +1069,7 @@
       <w:outlineLvl w:val="8"/>
     </w:pPr>
     <w:rPr>
-      <w:rFonts w:eastAsia="" w:cs="" w:cstheme="majorBidi" w:eastAsiaTheme="majorEastAsia"/>
+      <w:rFonts w:ascii="Gentium" w:hAnsi="Gentium" w:eastAsia="" w:cs="" w:cstheme="majorBidi" w:eastAsiaTheme="majorEastAsia"/>
       <w:color w:themeColor="text1" w:themeTint="d8" w:val="272727"/>
     </w:rPr>
   </w:style>
@@ -994,9 +1257,15 @@
     <w:qFormat/>
     <w:rPr/>
   </w:style>
+  <w:style w:type="character" w:styleId="FootnoteCharactersuser">
+    <w:name w:val="Footnote Characters (user)"/>
+    <w:qFormat/>
+    <w:rPr>
+      <w:vertAlign w:val="superscript"/>
+    </w:rPr>
+  </w:style>
   <w:style w:type="character" w:styleId="FootnoteCharacters">
     <w:name w:val="Footnote Characters"/>
-    <w:basedOn w:val="BodyTextChar"/>
     <w:qFormat/>
     <w:rPr>
       <w:vertAlign w:val="superscript"/>
@@ -1039,14 +1308,14 @@
       <w:color w:val="784B04"/>
     </w:rPr>
   </w:style>
-  <w:style w:type="character" w:styleId="CaptionCharacters">
-    <w:name w:val="Caption Characters"/>
+  <w:style w:type="character" w:styleId="CaptionCharactersuser">
+    <w:name w:val="Caption Characters (user)"/>
     <w:qFormat/>
     <w:rPr/>
   </w:style>
   <w:style w:type="character" w:styleId="ColorRed">
     <w:name w:val="ColorRed"/>
-    <w:basedOn w:val="CaptionCharacters"/>
+    <w:basedOn w:val="CaptionCharactersuser"/>
     <w:qFormat/>
     <w:rPr>
       <w:color w:val="FF0000"/>
@@ -1076,16 +1345,23 @@
       <w:color w:val="000000"/>
     </w:rPr>
   </w:style>
+  <w:style w:type="character" w:styleId="EndnoteCharacters">
+    <w:name w:val="Endnote Characters"/>
+    <w:qFormat/>
+    <w:rPr>
+      <w:vertAlign w:val="superscript"/>
+    </w:rPr>
+  </w:style>
+  <w:style w:type="character" w:styleId="EndnoteCharactersuser">
+    <w:name w:val="Endnote Characters (user)"/>
+    <w:qFormat/>
+    <w:rPr/>
+  </w:style>
   <w:style w:type="character" w:styleId="EndnoteReference">
     <w:name w:val="endnote reference"/>
     <w:rPr>
       <w:vertAlign w:val="superscript"/>
     </w:rPr>
-  </w:style>
-  <w:style w:type="character" w:styleId="EndnoteCharacters">
-    <w:name w:val="Endnote Characters"/>
-    <w:qFormat/>
-    <w:rPr/>
   </w:style>
   <w:style w:type="paragraph" w:styleId="Heading">
     <w:name w:val="Heading"/>
@@ -1110,7 +1386,9 @@
     <w:pPr>
       <w:spacing w:before="180" w:after="180"/>
     </w:pPr>
-    <w:rPr/>
+    <w:rPr>
+      <w:rFonts w:ascii="Gentium" w:hAnsi="Gentium"/>
+    </w:rPr>
   </w:style>
   <w:style w:type="paragraph" w:styleId="List">
     <w:name w:val="List"/>
@@ -1129,6 +1407,7 @@
       <w:spacing w:before="0" w:after="120"/>
     </w:pPr>
     <w:rPr>
+      <w:rFonts w:ascii="Gentium" w:hAnsi="Gentium"/>
       <w:i/>
     </w:rPr>
   </w:style>
@@ -1149,7 +1428,9 @@
     <w:next w:val="BodyText"/>
     <w:qFormat/>
     <w:pPr/>
-    <w:rPr/>
+    <w:rPr>
+      <w:rFonts w:ascii="Gentium" w:hAnsi="Gentium"/>
+    </w:rPr>
   </w:style>
   <w:style w:type="paragraph" w:styleId="Compact" w:customStyle="1">
     <w:name w:val="Compact"/>
@@ -1174,7 +1455,7 @@
       <w:jc w:val="center"/>
     </w:pPr>
     <w:rPr>
-      <w:rFonts w:ascii="Aptos Display" w:hAnsi="Aptos Display" w:eastAsia="" w:cs="" w:asciiTheme="majorHAnsi" w:cstheme="majorBidi" w:eastAsiaTheme="majorEastAsia" w:hAnsiTheme="majorHAnsi"/>
+      <w:rFonts w:ascii="Gentium" w:hAnsi="Gentium" w:eastAsia="" w:cs="" w:cstheme="majorBidi" w:eastAsiaTheme="majorEastAsia"/>
       <w:sz w:val="56"/>
       <w:szCs w:val="56"/>
     </w:rPr>
@@ -1251,6 +1532,7 @@
       <w:spacing w:before="100" w:after="300"/>
     </w:pPr>
     <w:rPr>
+      <w:rFonts w:ascii="Gentium" w:hAnsi="Gentium"/>
       <w:sz w:val="20"/>
       <w:szCs w:val="20"/>
     </w:rPr>
@@ -1282,7 +1564,9 @@
     <w:unhideWhenUsed/>
     <w:qFormat/>
     <w:pPr/>
-    <w:rPr/>
+    <w:rPr>
+      <w:rFonts w:ascii="Gentium" w:hAnsi="Gentium"/>
+    </w:rPr>
   </w:style>
   <w:style w:type="paragraph" w:styleId="FootnoteBlockText">
     <w:name w:val="Footnote Block Text"/>
@@ -1295,7 +1579,9 @@
       <w:spacing w:before="100" w:after="100"/>
       <w:ind w:hanging="0" w:left="480" w:right="480"/>
     </w:pPr>
-    <w:rPr/>
+    <w:rPr>
+      <w:rFonts w:ascii="Gentium" w:hAnsi="Gentium"/>
+    </w:rPr>
   </w:style>
   <w:style w:type="paragraph" w:styleId="DefinitionTerm" w:customStyle="1">
     <w:name w:val="Definition Term"/>
@@ -1308,6 +1594,7 @@
       <w:spacing w:before="0" w:after="0"/>
     </w:pPr>
     <w:rPr>
+      <w:rFonts w:ascii="Gentium" w:hAnsi="Gentium"/>
       <w:b/>
     </w:rPr>
   </w:style>
@@ -1316,7 +1603,9 @@
     <w:basedOn w:val="Normal"/>
     <w:qFormat/>
     <w:pPr/>
-    <w:rPr/>
+    <w:rPr>
+      <w:rFonts w:ascii="Gentium" w:hAnsi="Gentium"/>
+    </w:rPr>
   </w:style>
   <w:style w:type="paragraph" w:styleId="TableCaption" w:customStyle="1">
     <w:name w:val="Table Caption"/>
@@ -1372,6 +1661,46 @@
       <w:b w:val="false"/>
       <w:bCs w:val="false"/>
       <w:color w:themeColor="accent1" w:themeShade="bf" w:val="365F91"/>
+    </w:rPr>
+  </w:style>
+  <w:style w:type="paragraph" w:styleId="Heading10">
+    <w:name w:val="Heading 10"/>
+    <w:basedOn w:val="Heading"/>
+    <w:next w:val="BodyText"/>
+    <w:qFormat/>
+    <w:pPr>
+      <w:numPr>
+        <w:ilvl w:val="8"/>
+        <w:numId w:val="1"/>
+      </w:numPr>
+      <w:spacing w:before="60" w:after="60"/>
+      <w:outlineLvl w:val="8"/>
+    </w:pPr>
+    <w:rPr>
+      <w:b/>
+      <w:bCs/>
+      <w:sz w:val="18"/>
+      <w:szCs w:val="18"/>
+    </w:rPr>
+  </w:style>
+  <w:style w:type="paragraph" w:styleId="BodyTextIndent">
+    <w:name w:val="Body Text Indent"/>
+    <w:basedOn w:val="BodyText"/>
+    <w:pPr>
+      <w:ind w:hanging="0" w:left="283"/>
+    </w:pPr>
+    <w:rPr/>
+  </w:style>
+  <w:style w:type="paragraph" w:styleId="BlockQuotationuser">
+    <w:name w:val="Block Quotation (user)"/>
+    <w:basedOn w:val="Normal"/>
+    <w:qFormat/>
+    <w:pPr>
+      <w:spacing w:before="0" w:after="283"/>
+      <w:ind w:hanging="0" w:left="567" w:right="567"/>
+    </w:pPr>
+    <w:rPr>
+      <w:rFonts w:ascii="Gentium" w:hAnsi="Gentium"/>
     </w:rPr>
   </w:style>
   <w:style w:type="table" w:default="1" w:styleId="Table">

</xml_diff>

<commit_message>
Use more palatable colors in latex output
</commit_message>
<xml_diff>
--- a/pandoc/reference.docx
+++ b/pandoc/reference.docx
@@ -1257,15 +1257,15 @@
     <w:qFormat/>
     <w:rPr/>
   </w:style>
+  <w:style w:type="character" w:styleId="FootnoteCharacters">
+    <w:name w:val="Footnote Characters"/>
+    <w:qFormat/>
+    <w:rPr>
+      <w:vertAlign w:val="superscript"/>
+    </w:rPr>
+  </w:style>
   <w:style w:type="character" w:styleId="FootnoteCharactersuser">
     <w:name w:val="Footnote Characters (user)"/>
-    <w:qFormat/>
-    <w:rPr>
-      <w:vertAlign w:val="superscript"/>
-    </w:rPr>
-  </w:style>
-  <w:style w:type="character" w:styleId="FootnoteCharacters">
-    <w:name w:val="Footnote Characters"/>
     <w:qFormat/>
     <w:rPr>
       <w:vertAlign w:val="superscript"/>
@@ -1289,7 +1289,7 @@
     <w:basedOn w:val="BodyTextChar"/>
     <w:qFormat/>
     <w:rPr>
-      <w:color w:val="808080"/>
+      <w:color w:val="666666"/>
     </w:rPr>
   </w:style>
   <w:style w:type="character" w:styleId="ColorGreen">
@@ -1308,14 +1308,14 @@
       <w:color w:val="784B04"/>
     </w:rPr>
   </w:style>
-  <w:style w:type="character" w:styleId="CaptionCharactersuser">
-    <w:name w:val="Caption Characters (user)"/>
+  <w:style w:type="character" w:styleId="CaptionCharacters">
+    <w:name w:val="Caption Characters"/>
     <w:qFormat/>
     <w:rPr/>
   </w:style>
   <w:style w:type="character" w:styleId="ColorRed">
     <w:name w:val="ColorRed"/>
-    <w:basedOn w:val="CaptionCharactersuser"/>
+    <w:basedOn w:val="CaptionCharacters"/>
     <w:qFormat/>
     <w:rPr>
       <w:color w:val="FF0000"/>
@@ -1345,17 +1345,19 @@
       <w:color w:val="000000"/>
     </w:rPr>
   </w:style>
+  <w:style w:type="character" w:styleId="EndnoteCharactersuser">
+    <w:name w:val="Endnote Characters (user)"/>
+    <w:qFormat/>
+    <w:rPr>
+      <w:vertAlign w:val="superscript"/>
+    </w:rPr>
+  </w:style>
   <w:style w:type="character" w:styleId="EndnoteCharacters">
     <w:name w:val="Endnote Characters"/>
     <w:qFormat/>
     <w:rPr>
       <w:vertAlign w:val="superscript"/>
     </w:rPr>
-  </w:style>
-  <w:style w:type="character" w:styleId="EndnoteCharactersuser">
-    <w:name w:val="Endnote Characters (user)"/>
-    <w:qFormat/>
-    <w:rPr/>
   </w:style>
   <w:style w:type="character" w:styleId="EndnoteReference">
     <w:name w:val="endnote reference"/>
@@ -1691,8 +1693,8 @@
     </w:pPr>
     <w:rPr/>
   </w:style>
-  <w:style w:type="paragraph" w:styleId="BlockQuotationuser">
-    <w:name w:val="Block Quotation (user)"/>
+  <w:style w:type="paragraph" w:styleId="BlockQuotation">
+    <w:name w:val="Block Quotation"/>
     <w:basedOn w:val="Normal"/>
     <w:qFormat/>
     <w:pPr>

</xml_diff>

<commit_message>
Modify colors of docx output
</commit_message>
<xml_diff>
--- a/pandoc/reference.docx
+++ b/pandoc/reference.docx
@@ -283,7 +283,9 @@
     <w:p>
       <w:pPr>
         <w:pStyle w:val="BlockText"/>
-        <w:rPr/>
+        <w:rPr>
+          <w:rStyle w:val="ColorGray"/>
+        </w:rPr>
       </w:pPr>
       <w:r>
         <w:rPr/>
@@ -1297,7 +1299,7 @@
     <w:basedOn w:val="DefaultParagraphFont"/>
     <w:qFormat/>
     <w:rPr>
-      <w:color w:val="00A933"/>
+      <w:color w:val="069A2E"/>
     </w:rPr>
   </w:style>
   <w:style w:type="character" w:styleId="ColorBrown">
@@ -1318,7 +1320,7 @@
     <w:basedOn w:val="CaptionCharacters"/>
     <w:qFormat/>
     <w:rPr>
-      <w:color w:val="FF0000"/>
+      <w:color w:val="C9211E"/>
     </w:rPr>
   </w:style>
   <w:style w:type="character" w:styleId="ColorMagenta">
@@ -1334,7 +1336,7 @@
     <w:basedOn w:val="ColorGray"/>
     <w:qFormat/>
     <w:rPr>
-      <w:color w:val="3465A4"/>
+      <w:color w:val="355269"/>
     </w:rPr>
   </w:style>
   <w:style w:type="character" w:styleId="ColorBlack">

</xml_diff>

<commit_message>
Use better colors in pandoc output
</commit_message>
<xml_diff>
--- a/pandoc/reference.docx
+++ b/pandoc/reference.docx
@@ -1259,15 +1259,15 @@
     <w:qFormat/>
     <w:rPr/>
   </w:style>
+  <w:style w:type="character" w:styleId="FootnoteCharactersuser">
+    <w:name w:val="Footnote Characters (user)"/>
+    <w:qFormat/>
+    <w:rPr>
+      <w:vertAlign w:val="superscript"/>
+    </w:rPr>
+  </w:style>
   <w:style w:type="character" w:styleId="FootnoteCharacters">
     <w:name w:val="Footnote Characters"/>
-    <w:qFormat/>
-    <w:rPr>
-      <w:vertAlign w:val="superscript"/>
-    </w:rPr>
-  </w:style>
-  <w:style w:type="character" w:styleId="FootnoteCharactersuser">
-    <w:name w:val="Footnote Characters (user)"/>
     <w:qFormat/>
     <w:rPr>
       <w:vertAlign w:val="superscript"/>
@@ -1310,14 +1310,14 @@
       <w:color w:val="784B04"/>
     </w:rPr>
   </w:style>
-  <w:style w:type="character" w:styleId="CaptionCharacters">
-    <w:name w:val="Caption Characters"/>
+  <w:style w:type="character" w:styleId="CaptionCharactersuser">
+    <w:name w:val="Caption Characters (user)"/>
     <w:qFormat/>
     <w:rPr/>
   </w:style>
   <w:style w:type="character" w:styleId="ColorRed">
     <w:name w:val="ColorRed"/>
-    <w:basedOn w:val="CaptionCharacters"/>
+    <w:basedOn w:val="CaptionCharactersuser"/>
     <w:qFormat/>
     <w:rPr>
       <w:color w:val="C9211E"/>
@@ -1328,7 +1328,7 @@
     <w:basedOn w:val="ColorBrown"/>
     <w:qFormat/>
     <w:rPr>
-      <w:color w:val="A7074B"/>
+      <w:color w:val="800080"/>
     </w:rPr>
   </w:style>
   <w:style w:type="character" w:styleId="ColorBlue">
@@ -1336,7 +1336,7 @@
     <w:basedOn w:val="ColorGray"/>
     <w:qFormat/>
     <w:rPr>
-      <w:color w:val="355269"/>
+      <w:color w:val="2A6099"/>
     </w:rPr>
   </w:style>
   <w:style w:type="character" w:styleId="ColorBlack">
@@ -1347,15 +1347,15 @@
       <w:color w:val="000000"/>
     </w:rPr>
   </w:style>
+  <w:style w:type="character" w:styleId="EndnoteCharacters">
+    <w:name w:val="Endnote Characters"/>
+    <w:qFormat/>
+    <w:rPr>
+      <w:vertAlign w:val="superscript"/>
+    </w:rPr>
+  </w:style>
   <w:style w:type="character" w:styleId="EndnoteCharactersuser">
     <w:name w:val="Endnote Characters (user)"/>
-    <w:qFormat/>
-    <w:rPr>
-      <w:vertAlign w:val="superscript"/>
-    </w:rPr>
-  </w:style>
-  <w:style w:type="character" w:styleId="EndnoteCharacters">
-    <w:name w:val="Endnote Characters"/>
     <w:qFormat/>
     <w:rPr>
       <w:vertAlign w:val="superscript"/>
@@ -1695,8 +1695,8 @@
     </w:pPr>
     <w:rPr/>
   </w:style>
-  <w:style w:type="paragraph" w:styleId="BlockQuotation">
-    <w:name w:val="Block Quotation"/>
+  <w:style w:type="paragraph" w:styleId="BlockQuotationuser">
+    <w:name w:val="Block Quotation (user)"/>
     <w:basedOn w:val="Normal"/>
     <w:qFormat/>
     <w:pPr>

</xml_diff>